<commit_message>
docs: 0.8.1 manual docx
</commit_message>
<xml_diff>
--- a/manual/可塑性记忆-使用手册-0.8.1.docx
+++ b/manual/可塑性记忆-使用手册-0.8.1.docx
@@ -6267,6 +6267,21 @@
           <w:sz w:val="21"/>
         </w:rPr>
         <w:t>她真的说出某个候选时，会写一条低重要度记忆（fact_key=meme:&lt;slug&gt;，tags 带「梗」和场景）；在控制台长期记忆搜「梗」能看、能删。换梗库时先备份，再替换成同表同字段的 SQLite，桥接按修改时间自动重载。</w:t>
+      </w:r>
+    </w:p>
+    <w:p>
+      <w:pPr>
+        <w:spacing w:before="0" w:after="120" w:line="360" w:lineRule="auto"/>
+      </w:pPr>
+      <w:r>
+        <w:rPr>
+          <w:rFonts w:ascii="Microsoft YaHei" w:hAnsi="Microsoft YaHei" w:eastAsia="Microsoft YaHei"/>
+          <w:b w:val="0"/>
+          <w:i w:val="0"/>
+          <w:color w:val="24343A"/>
+          <w:sz w:val="21"/>
+        </w:rPr>
+        <w:t>图片消息会先做一次视觉描述/OCR，把图中的角色名、台词、梗名带进匹配；同一张图会缓存，不重复调用。</w:t>
       </w:r>
     </w:p>
     <w:p>

</xml_diff>